<commit_message>
EL6: audit fixes (named answers in feedback, balanced Spot the Slip choices), audit notes, final support files and index
Co-Authored-By: Claude Opus 5.5 <noreply@anthropic.com>
Claude-Session: https://claude.ai/code/session_013Y8PfETWcMLvmUEpCdE8Wq
</commit_message>
<xml_diff>
--- a/support-materials/EL6/EL6_worked_examples.docx
+++ b/support-materials/EL6/EL6_worked_examples.docx
@@ -612,7 +612,35 @@
         <w:t xml:space="preserve">=15</w:t>
       </w:r>
       <w:r>
-        <w:t xml:space="preserve">. Choice b moves the 6 into the exponent, but the exponent is only </w:t>
+        <w:t xml:space="preserve">. Writing </w:t>
+      </w:r>
+      <w:r>
+        <w:rPr>
+          <w:i/>
+          <w:iCs/>
+        </w:rPr>
+        <w:t xml:space="preserve">x−6=</w:t>
+      </w:r>
+      <w:r>
+        <w:t xml:space="preserve">log</w:t>
+      </w:r>
+      <w:r>
+        <w:rPr>
+          <w:i/>
+          <w:iCs/>
+          <w:vertAlign w:val="subscript"/>
+        </w:rPr>
+        <w:t xml:space="preserve">2</w:t>
+      </w:r>
+      <w:r>
+        <w:rPr>
+          <w:i/>
+          <w:iCs/>
+        </w:rPr>
+        <w:t xml:space="preserve"> 9</w:t>
+      </w:r>
+      <w:r>
+        <w:t xml:space="preserve"> moves the 6 into the exponent, but the exponent is only </w:t>
       </w:r>
       <w:r>
         <w:rPr>
@@ -890,7 +918,32 @@
         <w:t xml:space="preserve">=9</w:t>
       </w:r>
       <w:r>
-        <w:t xml:space="preserve">. Choice a skips the division and leaves out the 4. </w:t>
+        <w:t xml:space="preserve">. Writing </w:t>
+      </w:r>
+      <w:r>
+        <w:rPr>
+          <w:i/>
+          <w:iCs/>
+        </w:rPr>
+        <w:t xml:space="preserve">3</w:t>
+      </w:r>
+      <w:r>
+        <w:rPr>
+          <w:i/>
+          <w:iCs/>
+          <w:vertAlign w:val="superscript"/>
+        </w:rPr>
+        <w:t xml:space="preserve">8</w:t>
+      </w:r>
+      <w:r>
+        <w:rPr>
+          <w:i/>
+          <w:iCs/>
+        </w:rPr>
+        <w:t xml:space="preserve">=2x</w:t>
+      </w:r>
+      <w:r>
+        <w:t xml:space="preserve"> skips the division and leaves out the 4. </w:t>
       </w:r>
       <w:r>
         <w:rPr>
@@ -1156,7 +1209,32 @@
         <w:t xml:space="preserve">=8</w:t>
       </w:r>
       <w:r>
-        <w:t xml:space="preserve">. Choice a ignores the 7. </w:t>
+        <w:t xml:space="preserve">. Writing </w:t>
+      </w:r>
+      <w:r>
+        <w:rPr>
+          <w:i/>
+          <w:iCs/>
+        </w:rPr>
+        <w:t xml:space="preserve">2</w:t>
+      </w:r>
+      <w:r>
+        <w:rPr>
+          <w:i/>
+          <w:iCs/>
+          <w:vertAlign w:val="superscript"/>
+        </w:rPr>
+        <w:t xml:space="preserve">10</w:t>
+      </w:r>
+      <w:r>
+        <w:rPr>
+          <w:i/>
+          <w:iCs/>
+        </w:rPr>
+        <w:t xml:space="preserve">=5x</w:t>
+      </w:r>
+      <w:r>
+        <w:t xml:space="preserve"> ignores the 7. </w:t>
       </w:r>
       <w:r>
         <w:rPr>
@@ -1936,7 +2014,49 @@
         <w:t xml:space="preserve">14−5=9</w:t>
       </w:r>
       <w:r>
-        <w:t xml:space="preserve">. Choice b moves the 5 into the exponent, and choice c subtracts 5 when it should add. </w:t>
+        <w:t xml:space="preserve">. The answer </w:t>
+      </w:r>
+      <w:r>
+        <w:t xml:space="preserve">log</w:t>
+      </w:r>
+      <w:r>
+        <w:rPr>
+          <w:i/>
+          <w:iCs/>
+          <w:vertAlign w:val="subscript"/>
+        </w:rPr>
+        <w:t xml:space="preserve">2</w:t>
+      </w:r>
+      <w:r>
+        <w:rPr>
+          <w:i/>
+          <w:iCs/>
+        </w:rPr>
+        <w:t xml:space="preserve">(9)+5</w:t>
+      </w:r>
+      <w:r>
+        <w:t xml:space="preserve"> moves the 5 into the exponent, and </w:t>
+      </w:r>
+      <w:r>
+        <w:t xml:space="preserve">log</w:t>
+      </w:r>
+      <w:r>
+        <w:rPr>
+          <w:i/>
+          <w:iCs/>
+          <w:vertAlign w:val="subscript"/>
+        </w:rPr>
+        <w:t xml:space="preserve">2</w:t>
+      </w:r>
+      <w:r>
+        <w:rPr>
+          <w:i/>
+          <w:iCs/>
+        </w:rPr>
+        <w:t xml:space="preserve">(4)</w:t>
+      </w:r>
+      <w:r>
+        <w:t xml:space="preserve"> subtracts 5 when it should add. </w:t>
       </w:r>
       <w:r>
         <w:rPr>
@@ -2290,7 +2410,28 @@
         <w:t xml:space="preserve">(6)+3</w:t>
       </w:r>
       <w:r>
-        <w:t xml:space="preserve">. Choice d adds 3 inside the logarithm, but the 3 was never with the 6. </w:t>
+        <w:t xml:space="preserve">. The answer </w:t>
+      </w:r>
+      <w:r>
+        <w:t xml:space="preserve">log</w:t>
+      </w:r>
+      <w:r>
+        <w:rPr>
+          <w:i/>
+          <w:iCs/>
+          <w:vertAlign w:val="subscript"/>
+        </w:rPr>
+        <w:t xml:space="preserve">4</w:t>
+      </w:r>
+      <w:r>
+        <w:rPr>
+          <w:i/>
+          <w:iCs/>
+        </w:rPr>
+        <w:t xml:space="preserve">(9)</w:t>
+      </w:r>
+      <w:r>
+        <w:t xml:space="preserve"> adds 3 inside the logarithm, but the 3 was never with the 6. </w:t>
       </w:r>
       <w:r>
         <w:rPr>
@@ -2631,7 +2772,28 @@
         <w:t xml:space="preserve">(12)</w:t>
       </w:r>
       <w:r>
-        <w:t xml:space="preserve">. Choice d subtracts 8, which gives a logarithm of a negative number. That is not defined, which is a sign something went wrong. </w:t>
+        <w:t xml:space="preserve">. Subtracting 8 instead gives </w:t>
+      </w:r>
+      <w:r>
+        <w:t xml:space="preserve">log</w:t>
+      </w:r>
+      <w:r>
+        <w:rPr>
+          <w:i/>
+          <w:iCs/>
+          <w:vertAlign w:val="subscript"/>
+        </w:rPr>
+        <w:t xml:space="preserve">3</w:t>
+      </w:r>
+      <w:r>
+        <w:rPr>
+          <w:i/>
+          <w:iCs/>
+        </w:rPr>
+        <w:t xml:space="preserve">(−4)</w:t>
+      </w:r>
+      <w:r>
+        <w:t xml:space="preserve">, a logarithm of a negative number. That is not defined, which is a sign something went wrong. </w:t>
       </w:r>
       <w:r>
         <w:rPr>
@@ -2913,16 +3075,6 @@
         <w:t xml:space="preserve">. Check: </w:t>
       </w:r>
       <w:r>
-        <w:rPr>
-          <w:i/>
-          <w:iCs/>
-        </w:rPr>
-        <w:t xml:space="preserve">5·8/5=8</w:t>
-      </w:r>
-      <w:r>
-        <w:t xml:space="preserve">, </w:t>
-      </w:r>
-      <w:r>
         <w:t xml:space="preserve">log</w:t>
       </w:r>
       <w:r>
@@ -2951,7 +3103,17 @@
         <w:t xml:space="preserve">3· 3=9</w:t>
       </w:r>
       <w:r>
-        <w:t xml:space="preserve">. Choice b is </w:t>
+        <w:t xml:space="preserve">. The answer </w:t>
+      </w:r>
+      <w:r>
+        <w:rPr>
+          <w:i/>
+          <w:iCs/>
+        </w:rPr>
+        <w:t xml:space="preserve">512/5</w:t>
+      </w:r>
+      <w:r>
+        <w:t xml:space="preserve"> is </w:t>
       </w:r>
       <w:r>
         <w:rPr>
@@ -2976,7 +3138,17 @@
         <w:t xml:space="preserve">)/5</w:t>
       </w:r>
       <w:r>
-        <w:t xml:space="preserve">, which skips dividing by 3. Choice c uses </w:t>
+        <w:t xml:space="preserve">, which skips dividing by 3. The answer </w:t>
+      </w:r>
+      <w:r>
+        <w:rPr>
+          <w:i/>
+          <w:iCs/>
+        </w:rPr>
+        <w:t xml:space="preserve">6/5</w:t>
+      </w:r>
+      <w:r>
+        <w:t xml:space="preserve"> uses </w:t>
       </w:r>
       <w:r>
         <w:rPr>
@@ -3257,7 +3429,17 @@
         <w:t xml:space="preserve">x=9/4</w:t>
       </w:r>
       <w:r>
-        <w:t xml:space="preserve">. Choice d is </w:t>
+        <w:t xml:space="preserve">. The answer </w:t>
+      </w:r>
+      <w:r>
+        <w:rPr>
+          <w:i/>
+          <w:iCs/>
+        </w:rPr>
+        <w:t xml:space="preserve">6561/4</w:t>
+      </w:r>
+      <w:r>
+        <w:t xml:space="preserve"> is </w:t>
       </w:r>
       <w:r>
         <w:rPr>
@@ -3282,7 +3464,17 @@
         <w:t xml:space="preserve">)/4</w:t>
       </w:r>
       <w:r>
-        <w:t xml:space="preserve">, which ignores the 6. Choice a uses </w:t>
+        <w:t xml:space="preserve">, which ignores the 6. The answer </w:t>
+      </w:r>
+      <w:r>
+        <w:rPr>
+          <w:i/>
+          <w:iCs/>
+        </w:rPr>
+        <w:t xml:space="preserve">3/2</w:t>
+      </w:r>
+      <w:r>
+        <w:t xml:space="preserve"> uses </w:t>
       </w:r>
       <w:r>
         <w:rPr>
@@ -3310,7 +3502,17 @@
         <w:t xml:space="preserve">2</w:t>
       </w:r>
       <w:r>
-        <w:t xml:space="preserve">. Choice b divides the wrong way. </w:t>
+        <w:t xml:space="preserve">, and </w:t>
+      </w:r>
+      <w:r>
+        <w:rPr>
+          <w:i/>
+          <w:iCs/>
+        </w:rPr>
+        <w:t xml:space="preserve">4/9</w:t>
+      </w:r>
+      <w:r>
+        <w:t xml:space="preserve"> divides the wrong way. </w:t>
       </w:r>
       <w:r>
         <w:rPr>
@@ -3563,7 +3765,17 @@
         <w:t xml:space="preserve">w=25/3</w:t>
       </w:r>
       <w:r>
-        <w:t xml:space="preserve">. Choice a is </w:t>
+        <w:t xml:space="preserve">. The answer </w:t>
+      </w:r>
+      <w:r>
+        <w:rPr>
+          <w:i/>
+          <w:iCs/>
+        </w:rPr>
+        <w:t xml:space="preserve">625/3</w:t>
+      </w:r>
+      <w:r>
+        <w:t xml:space="preserve"> is </w:t>
       </w:r>
       <w:r>
         <w:rPr>
@@ -3588,7 +3800,7 @@
         <w:t xml:space="preserve">)/3</w:t>
       </w:r>
       <w:r>
-        <w:t xml:space="preserve">, which skips dividing by 2. Choice b multiplies by 3 at the end instead of dividing. </w:t>
+        <w:t xml:space="preserve">, which skips dividing by 2. The answer 75 multiplies by 3 at the end instead of dividing. </w:t>
       </w:r>
       <w:r>
         <w:rPr>
@@ -3856,7 +4068,42 @@
         <w:t xml:space="preserve">n=64/7</w:t>
       </w:r>
       <w:r>
-        <w:t xml:space="preserve">. Choice c switches forms before subtracting the 9. Choice b uses </w:t>
+        <w:t xml:space="preserve">. The answer </w:t>
+      </w:r>
+      <w:r>
+        <w:rPr>
+          <w:i/>
+          <w:iCs/>
+        </w:rPr>
+        <w:t xml:space="preserve">(4</w:t>
+      </w:r>
+      <w:r>
+        <w:rPr>
+          <w:i/>
+          <w:iCs/>
+          <w:vertAlign w:val="superscript"/>
+        </w:rPr>
+        <w:t xml:space="preserve">12</w:t>
+      </w:r>
+      <w:r>
+        <w:rPr>
+          <w:i/>
+          <w:iCs/>
+        </w:rPr>
+        <w:t xml:space="preserve">)/7</w:t>
+      </w:r>
+      <w:r>
+        <w:t xml:space="preserve"> switches forms before subtracting the 9, and </w:t>
+      </w:r>
+      <w:r>
+        <w:rPr>
+          <w:i/>
+          <w:iCs/>
+        </w:rPr>
+        <w:t xml:space="preserve">12/7</w:t>
+      </w:r>
+      <w:r>
+        <w:t xml:space="preserve"> uses </w:t>
       </w:r>
       <w:r>
         <w:rPr>
@@ -4293,7 +4540,7 @@
         <w:t xml:space="preserve">A.  </w:t>
       </w:r>
       <w:r>
-        <w:t xml:space="preserve">The 7 is not in the exponent. The student should add 7 before switching forms.</w:t>
+        <w:t xml:space="preserve">The 7 is outside the power. Add it before switching forms.</w:t>
       </w:r>
     </w:p>
     <w:p>
@@ -4309,7 +4556,7 @@
         <w:t xml:space="preserve">B.  </w:t>
       </w:r>
       <w:r>
-        <w:t xml:space="preserve">The base of the logarithm should be 9.</w:t>
+        <w:t xml:space="preserve">The base of the logarithm should be 9, not 4.</w:t>
       </w:r>
     </w:p>
     <w:p>
@@ -4325,7 +4572,7 @@
         <w:t xml:space="preserve">C.  </w:t>
       </w:r>
       <w:r>
-        <w:t xml:space="preserve">The student should have divided both sides by 4.</w:t>
+        <w:t xml:space="preserve">Both sides should be divided by 4 first.</w:t>
       </w:r>
     </w:p>
     <w:p>
@@ -4927,7 +5174,7 @@
         <w:t xml:space="preserve">A.  </w:t>
       </w:r>
       <w:r>
-        <w:t xml:space="preserve">The 4 should have been divided, not subtracted.</w:t>
+        <w:t xml:space="preserve">Both sides should have been divided by 4, not had 4 subtracted.</w:t>
       </w:r>
     </w:p>
     <w:p>
@@ -4943,7 +5190,7 @@
         <w:t xml:space="preserve">B.  </w:t>
       </w:r>
       <w:r>
-        <w:t xml:space="preserve">The base should be 3, not 2.</w:t>
+        <w:t xml:space="preserve">The base of the logarithm should be 3, not 2.</w:t>
       </w:r>
     </w:p>
     <w:p>
@@ -4975,7 +5222,7 @@
         <w:t xml:space="preserve">D.  </w:t>
       </w:r>
       <w:r>
-        <w:t xml:space="preserve">In the last step, 3 x should equal 2 to the 3rd power, which is 8, not 2 times 3.</w:t>
+        <w:t xml:space="preserve">In the last step, 2 and 3 were multiplied instead of using 3 as an exponent.</w:t>
       </w:r>
     </w:p>
     <w:p>

</xml_diff>